<commit_message>
Add live demo screenshots and complete report appendices
Add pipeline, match board, API, upload and training screenshots; expand appendices with artifact inventory, match-plan schema, cost calculations, repository map and evaluation checklist.

Co-Authored-By: Claude Code <noreply@anthropic.com>
</commit_message>
<xml_diff>
--- a/docs/Matchcall_Project_Report.docx
+++ b/docs/Matchcall_Project_Report.docx
@@ -5598,6 +5598,169 @@
     </w:p>
     <w:p>
       <w:pPr>
+        <w:pStyle w:val="Heading2"/>
+      </w:pPr>
+      <w:r>
+        <w:t>8.10 Demo Interface</w:t>
+      </w:r>
+    </w:p>
+    <w:p>
+      <w:pPr>
+        <w:jc w:val="both"/>
+      </w:pPr>
+      <w:r>
+        <w:t>The browser demo exposes the pipeline in the order the project runs: the five-stage pipeline, the ARG–FRA match board and reel, the API-Football example, the upload/match-plan form, and the training/ClearML evidence. Figures 11–13 show the live Stadium Board build. The screenshots are from the running application, not mock-ups.</w:t>
+      </w:r>
+    </w:p>
+    <w:p>
+      <w:pPr>
+        <w:spacing w:before="80" w:after="40"/>
+        <w:jc w:val="center"/>
+      </w:pPr>
+      <w:r>
+        <w:drawing>
+          <wp:inline xmlns:a="http://schemas.openxmlformats.org/drawingml/2006/main" xmlns:pic="http://schemas.openxmlformats.org/drawingml/2006/picture">
+            <wp:extent cx="5669280" cy="4287393"/>
+            <wp:docPr id="11" name="Picture 11"/>
+            <wp:cNvGraphicFramePr>
+              <a:graphicFrameLocks noChangeAspect="1"/>
+            </wp:cNvGraphicFramePr>
+            <a:graphic>
+              <a:graphicData uri="http://schemas.openxmlformats.org/drawingml/2006/picture">
+                <pic:pic>
+                  <pic:nvPicPr>
+                    <pic:cNvPr id="0" name="demo_pipeline.png"/>
+                    <pic:cNvPicPr/>
+                  </pic:nvPicPr>
+                  <pic:blipFill>
+                    <a:blip r:embed="rId20"/>
+                    <a:stretch>
+                      <a:fillRect/>
+                    </a:stretch>
+                  </pic:blipFill>
+                  <pic:spPr>
+                    <a:xfrm>
+                      <a:off x="0" y="0"/>
+                      <a:ext cx="5669280" cy="4287393"/>
+                    </a:xfrm>
+                    <a:prstGeom prst="rect"/>
+                  </pic:spPr>
+                </pic:pic>
+              </a:graphicData>
+            </a:graphic>
+          </wp:inline>
+        </w:drawing>
+      </w:r>
+    </w:p>
+    <w:p>
+      <w:pPr>
+        <w:pStyle w:val="ReportCaption"/>
+        <w:jc w:val="left"/>
+      </w:pPr>
+      <w:r>
+        <w:t>Figure 11. Live pipeline screen. The formation map and five stage cards expose action spotting, tracking, the fact sheet, commentary and voice.</w:t>
+      </w:r>
+    </w:p>
+    <w:p>
+      <w:pPr>
+        <w:spacing w:before="80" w:after="40"/>
+        <w:jc w:val="center"/>
+      </w:pPr>
+      <w:r>
+        <w:drawing>
+          <wp:inline xmlns:a="http://schemas.openxmlformats.org/drawingml/2006/main" xmlns:pic="http://schemas.openxmlformats.org/drawingml/2006/picture">
+            <wp:extent cx="5669280" cy="5661406"/>
+            <wp:docPr id="12" name="Picture 12"/>
+            <wp:cNvGraphicFramePr>
+              <a:graphicFrameLocks noChangeAspect="1"/>
+            </wp:cNvGraphicFramePr>
+            <a:graphic>
+              <a:graphicData uri="http://schemas.openxmlformats.org/drawingml/2006/picture">
+                <pic:pic>
+                  <pic:nvPicPr>
+                    <pic:cNvPr id="0" name="demo_match.png"/>
+                    <pic:cNvPicPr/>
+                  </pic:nvPicPr>
+                  <pic:blipFill>
+                    <a:blip r:embed="rId21"/>
+                    <a:stretch>
+                      <a:fillRect/>
+                    </a:stretch>
+                  </pic:blipFill>
+                  <pic:spPr>
+                    <a:xfrm>
+                      <a:off x="0" y="0"/>
+                      <a:ext cx="5669280" cy="5661406"/>
+                    </a:xfrm>
+                    <a:prstGeom prst="rect"/>
+                  </pic:spPr>
+                </pic:pic>
+              </a:graphicData>
+            </a:graphic>
+          </wp:inline>
+        </w:drawing>
+      </w:r>
+    </w:p>
+    <w:p>
+      <w:pPr>
+        <w:pStyle w:val="ReportCaption"/>
+        <w:jc w:val="left"/>
+      </w:pPr>
+      <w:r>
+        <w:t>Figure 12. Live ARG–FRA board and reel. The scoreboard, commentary bus, possession bar, player tracking and rundown are all driven by the same event/fact artifacts.</w:t>
+      </w:r>
+    </w:p>
+    <w:p>
+      <w:pPr>
+        <w:spacing w:before="80" w:after="40"/>
+        <w:jc w:val="center"/>
+      </w:pPr>
+      <w:r>
+        <w:drawing>
+          <wp:inline xmlns:a="http://schemas.openxmlformats.org/drawingml/2006/main" xmlns:pic="http://schemas.openxmlformats.org/drawingml/2006/picture">
+            <wp:extent cx="5669280" cy="3291332"/>
+            <wp:docPr id="13" name="Picture 13"/>
+            <wp:cNvGraphicFramePr>
+              <a:graphicFrameLocks noChangeAspect="1"/>
+            </wp:cNvGraphicFramePr>
+            <a:graphic>
+              <a:graphicData uri="http://schemas.openxmlformats.org/drawingml/2006/picture">
+                <pic:pic>
+                  <pic:nvPicPr>
+                    <pic:cNvPr id="0" name="demo_api.png"/>
+                    <pic:cNvPicPr/>
+                  </pic:nvPicPr>
+                  <pic:blipFill>
+                    <a:blip r:embed="rId22"/>
+                    <a:stretch>
+                      <a:fillRect/>
+                    </a:stretch>
+                  </pic:blipFill>
+                  <pic:spPr>
+                    <a:xfrm>
+                      <a:off x="0" y="0"/>
+                      <a:ext cx="5669280" cy="3291332"/>
+                    </a:xfrm>
+                    <a:prstGeom prst="rect"/>
+                  </pic:spPr>
+                </pic:pic>
+              </a:graphicData>
+            </a:graphic>
+          </wp:inline>
+        </w:drawing>
+      </w:r>
+    </w:p>
+    <w:p>
+      <w:pPr>
+        <w:pStyle w:val="ReportCaption"/>
+        <w:jc w:val="left"/>
+      </w:pPr>
+      <w:r>
+        <w:t>Figure 13. Live API-Football section. The real fixture, returned events, grounded GPT-2 line and API-to-voice flow are shown next to the video path.</w:t>
+      </w:r>
+    </w:p>
+    <w:p>
+      <w:pPr>
         <w:pStyle w:val="Heading1"/>
       </w:pPr>
       <w:r>
@@ -5950,7 +6113,7 @@
         <w:jc w:val="both"/>
       </w:pPr>
       <w:r>
-        <w:t>The main artifacts are produced by the following commands. The full-match job is 7c23a8a91829; the corrected goal clip is 8cdba651f954. The API example is scripts/api_feed_current_example.py.</w:t>
+        <w:t>The commands below assume the project virtual environment and the ARG–FRA video. The full-match job is 7c23a8a91829 and the corrected goal clip is 8cdba651f954. The API example is scripts/api_feed_current_example.py. ClearML project: Football Commentator (ef18bd575abc408591532be2ac8f39b8).</w:t>
       </w:r>
     </w:p>
     <w:p>
@@ -6015,6 +6178,520 @@
     </w:p>
     <w:p>
       <w:pPr>
+        <w:ind w:left="288"/>
+      </w:pPr>
+      <w:r>
+        <w:rPr>
+          <w:rFonts w:ascii="Consolas" w:hAnsi="Consolas"/>
+          <w:sz w:val="18"/>
+        </w:rPr>
+        <w:t>python scripts/train_yolo26.py --epochs 50 --imgsz 640 --batch 16 --clearml</w:t>
+      </w:r>
+    </w:p>
+    <w:p>
+      <w:pPr>
+        <w:ind w:left="288"/>
+      </w:pPr>
+      <w:r>
+        <w:rPr>
+          <w:rFonts w:ascii="Consolas" w:hAnsi="Consolas"/>
+          <w:sz w:val="18"/>
+        </w:rPr>
+        <w:t>python -m uvicorn app.webapp:app --host 127.0.0.1 --port 8100</w:t>
+      </w:r>
+    </w:p>
+    <w:p>
+      <w:pPr>
+        <w:pStyle w:val="ReportCaption"/>
+        <w:jc w:val="left"/>
+      </w:pPr>
+      <w:r>
+        <w:t>Table 9. Reproducibility artifacts and where they live.</w:t>
+      </w:r>
+    </w:p>
+    <w:tbl>
+      <w:tblPr>
+        <w:tblW w:type="auto" w:w="0"/>
+        <w:jc w:val="center"/>
+        <w:tblLook w:firstColumn="1" w:firstRow="1" w:lastColumn="0" w:lastRow="0" w:noHBand="0" w:noVBand="1" w:val="04A0"/>
+        <w:tblBorders>
+          <w:top w:val="single" w:sz="4" w:space="0" w:color="BFBFBF"/>
+          <w:left w:val="single" w:sz="4" w:space="0" w:color="BFBFBF"/>
+          <w:bottom w:val="single" w:sz="4" w:space="0" w:color="BFBFBF"/>
+          <w:right w:val="single" w:sz="4" w:space="0" w:color="BFBFBF"/>
+          <w:insideH w:val="single" w:sz="4" w:space="0" w:color="BFBFBF"/>
+          <w:insideV w:val="single" w:sz="4" w:space="0" w:color="BFBFBF"/>
+        </w:tblBorders>
+      </w:tblPr>
+      <w:tblGrid>
+        <w:gridCol w:w="3009"/>
+        <w:gridCol w:w="3009"/>
+        <w:gridCol w:w="3009"/>
+      </w:tblGrid>
+      <w:tr>
+        <w:tc>
+          <w:tcPr>
+            <w:tcW w:type="dxa" w:w="2304"/>
+            <w:shd w:val="clear" w:color="auto" w:fill="E7E6E6"/>
+            <w:vAlign w:val="center"/>
+          </w:tcPr>
+          <w:p>
+            <w:r/>
+            <w:r>
+              <w:rPr>
+                <w:rFonts w:ascii="Calibri" w:hAnsi="Calibri"/>
+                <w:b/>
+                <w:sz w:val="16"/>
+              </w:rPr>
+              <w:t>Artifact</w:t>
+            </w:r>
+          </w:p>
+        </w:tc>
+        <w:tc>
+          <w:tcPr>
+            <w:tcW w:type="dxa" w:w="4320"/>
+            <w:shd w:val="clear" w:color="auto" w:fill="E7E6E6"/>
+            <w:vAlign w:val="center"/>
+          </w:tcPr>
+          <w:p>
+            <w:r/>
+            <w:r>
+              <w:rPr>
+                <w:rFonts w:ascii="Calibri" w:hAnsi="Calibri"/>
+                <w:b/>
+                <w:sz w:val="16"/>
+              </w:rPr>
+              <w:t>Where</w:t>
+            </w:r>
+          </w:p>
+        </w:tc>
+        <w:tc>
+          <w:tcPr>
+            <w:tcW w:type="dxa" w:w="2880"/>
+            <w:shd w:val="clear" w:color="auto" w:fill="E7E6E6"/>
+            <w:vAlign w:val="center"/>
+          </w:tcPr>
+          <w:p>
+            <w:r/>
+            <w:r>
+              <w:rPr>
+                <w:rFonts w:ascii="Calibri" w:hAnsi="Calibri"/>
+                <w:b/>
+                <w:sz w:val="16"/>
+              </w:rPr>
+              <w:t>Purpose</w:t>
+            </w:r>
+          </w:p>
+        </w:tc>
+      </w:tr>
+      <w:tr>
+        <w:tc>
+          <w:tcPr>
+            <w:tcW w:type="dxa" w:w="2304"/>
+            <w:vAlign w:val="center"/>
+          </w:tcPr>
+          <w:p>
+            <w:r/>
+            <w:r>
+              <w:rPr>
+                <w:rFonts w:ascii="Calibri" w:hAnsi="Calibri"/>
+                <w:sz w:val="16"/>
+              </w:rPr>
+              <w:t>Commentary comparison</w:t>
+            </w:r>
+          </w:p>
+        </w:tc>
+        <w:tc>
+          <w:tcPr>
+            <w:tcW w:type="dxa" w:w="4320"/>
+            <w:vAlign w:val="center"/>
+          </w:tcPr>
+          <w:p>
+            <w:r/>
+            <w:r>
+              <w:rPr>
+                <w:rFonts w:ascii="Calibri" w:hAnsi="Calibri"/>
+                <w:sz w:val="16"/>
+              </w:rPr>
+              <w:t>output/comparison/commentary_comparison.json</w:t>
+            </w:r>
+          </w:p>
+        </w:tc>
+        <w:tc>
+          <w:tcPr>
+            <w:tcW w:type="dxa" w:w="2880"/>
+            <w:vAlign w:val="center"/>
+          </w:tcPr>
+          <w:p>
+            <w:r/>
+            <w:r>
+              <w:rPr>
+                <w:rFonts w:ascii="Calibri" w:hAnsi="Calibri"/>
+                <w:sz w:val="16"/>
+              </w:rPr>
+              <w:t>40-prompt metrics and lines</w:t>
+            </w:r>
+          </w:p>
+        </w:tc>
+      </w:tr>
+      <w:tr>
+        <w:tc>
+          <w:tcPr>
+            <w:tcW w:type="dxa" w:w="2304"/>
+            <w:vAlign w:val="center"/>
+          </w:tcPr>
+          <w:p>
+            <w:r/>
+            <w:r>
+              <w:rPr>
+                <w:rFonts w:ascii="Calibri" w:hAnsi="Calibri"/>
+                <w:sz w:val="16"/>
+              </w:rPr>
+              <w:t>Bootstrap statistics</w:t>
+            </w:r>
+          </w:p>
+        </w:tc>
+        <w:tc>
+          <w:tcPr>
+            <w:tcW w:type="dxa" w:w="4320"/>
+            <w:vAlign w:val="center"/>
+          </w:tcPr>
+          <w:p>
+            <w:r/>
+            <w:r>
+              <w:rPr>
+                <w:rFonts w:ascii="Calibri" w:hAnsi="Calibri"/>
+                <w:sz w:val="16"/>
+              </w:rPr>
+              <w:t>output/comparison/commentary_bootstrap.json</w:t>
+            </w:r>
+          </w:p>
+        </w:tc>
+        <w:tc>
+          <w:tcPr>
+            <w:tcW w:type="dxa" w:w="2880"/>
+            <w:vAlign w:val="center"/>
+          </w:tcPr>
+          <w:p>
+            <w:r/>
+            <w:r>
+              <w:rPr>
+                <w:rFonts w:ascii="Calibri" w:hAnsi="Calibri"/>
+                <w:sz w:val="16"/>
+              </w:rPr>
+              <w:t>95% CIs and p-values</w:t>
+            </w:r>
+          </w:p>
+        </w:tc>
+      </w:tr>
+      <w:tr>
+        <w:tc>
+          <w:tcPr>
+            <w:tcW w:type="dxa" w:w="2304"/>
+            <w:vAlign w:val="center"/>
+          </w:tcPr>
+          <w:p>
+            <w:r/>
+            <w:r>
+              <w:rPr>
+                <w:rFonts w:ascii="Calibri" w:hAnsi="Calibri"/>
+                <w:sz w:val="16"/>
+              </w:rPr>
+              <w:t>Event spotting</w:t>
+            </w:r>
+          </w:p>
+        </w:tc>
+        <w:tc>
+          <w:tcPr>
+            <w:tcW w:type="dxa" w:w="4320"/>
+            <w:vAlign w:val="center"/>
+          </w:tcPr>
+          <w:p>
+            <w:r/>
+            <w:r>
+              <w:rPr>
+                <w:rFonts w:ascii="Calibri" w:hAnsi="Calibri"/>
+                <w:sz w:val="16"/>
+              </w:rPr>
+              <w:t>output/experiments/event_spotting.json</w:t>
+            </w:r>
+          </w:p>
+        </w:tc>
+        <w:tc>
+          <w:tcPr>
+            <w:tcW w:type="dxa" w:w="2880"/>
+            <w:vAlign w:val="center"/>
+          </w:tcPr>
+          <w:p>
+            <w:r/>
+            <w:r>
+              <w:rPr>
+                <w:rFonts w:ascii="Calibri" w:hAnsi="Calibri"/>
+                <w:sz w:val="16"/>
+              </w:rPr>
+              <w:t>Ten-moment recall and goal precision</w:t>
+            </w:r>
+          </w:p>
+        </w:tc>
+      </w:tr>
+      <w:tr>
+        <w:tc>
+          <w:tcPr>
+            <w:tcW w:type="dxa" w:w="2304"/>
+            <w:vAlign w:val="center"/>
+          </w:tcPr>
+          <w:p>
+            <w:r/>
+            <w:r>
+              <w:rPr>
+                <w:rFonts w:ascii="Calibri" w:hAnsi="Calibri"/>
+                <w:sz w:val="16"/>
+              </w:rPr>
+              <w:t>Full-match job</w:t>
+            </w:r>
+          </w:p>
+        </w:tc>
+        <w:tc>
+          <w:tcPr>
+            <w:tcW w:type="dxa" w:w="4320"/>
+            <w:vAlign w:val="center"/>
+          </w:tcPr>
+          <w:p>
+            <w:r/>
+            <w:r>
+              <w:rPr>
+                <w:rFonts w:ascii="Calibri" w:hAnsi="Calibri"/>
+                <w:sz w:val="16"/>
+              </w:rPr>
+              <w:t>7c23a8a91829</w:t>
+            </w:r>
+          </w:p>
+        </w:tc>
+        <w:tc>
+          <w:tcPr>
+            <w:tcW w:type="dxa" w:w="2880"/>
+            <w:vAlign w:val="center"/>
+          </w:tcPr>
+          <w:p>
+            <w:r/>
+            <w:r>
+              <w:rPr>
+                <w:rFonts w:ascii="Calibri" w:hAnsi="Calibri"/>
+                <w:sz w:val="16"/>
+              </w:rPr>
+              <w:t>43-line ARG–FRA run</w:t>
+            </w:r>
+          </w:p>
+        </w:tc>
+      </w:tr>
+      <w:tr>
+        <w:tc>
+          <w:tcPr>
+            <w:tcW w:type="dxa" w:w="2304"/>
+            <w:vAlign w:val="center"/>
+          </w:tcPr>
+          <w:p>
+            <w:r/>
+            <w:r>
+              <w:rPr>
+                <w:rFonts w:ascii="Calibri" w:hAnsi="Calibri"/>
+                <w:sz w:val="16"/>
+              </w:rPr>
+              <w:t>Corrected goal clip</w:t>
+            </w:r>
+          </w:p>
+        </w:tc>
+        <w:tc>
+          <w:tcPr>
+            <w:tcW w:type="dxa" w:w="4320"/>
+            <w:vAlign w:val="center"/>
+          </w:tcPr>
+          <w:p>
+            <w:r/>
+            <w:r>
+              <w:rPr>
+                <w:rFonts w:ascii="Calibri" w:hAnsi="Calibri"/>
+                <w:sz w:val="16"/>
+              </w:rPr>
+              <w:t>8cdba651f954</w:t>
+            </w:r>
+          </w:p>
+        </w:tc>
+        <w:tc>
+          <w:tcPr>
+            <w:tcW w:type="dxa" w:w="2880"/>
+            <w:vAlign w:val="center"/>
+          </w:tcPr>
+          <w:p>
+            <w:r/>
+            <w:r>
+              <w:rPr>
+                <w:rFonts w:ascii="Calibri" w:hAnsi="Calibri"/>
+                <w:sz w:val="16"/>
+              </w:rPr>
+              <w:t>Goal-anchor verification</w:t>
+            </w:r>
+          </w:p>
+        </w:tc>
+      </w:tr>
+      <w:tr>
+        <w:tc>
+          <w:tcPr>
+            <w:tcW w:type="dxa" w:w="2304"/>
+            <w:vAlign w:val="center"/>
+          </w:tcPr>
+          <w:p>
+            <w:r/>
+            <w:r>
+              <w:rPr>
+                <w:rFonts w:ascii="Calibri" w:hAnsi="Calibri"/>
+                <w:sz w:val="16"/>
+              </w:rPr>
+              <w:t>YOLO26n run</w:t>
+            </w:r>
+          </w:p>
+        </w:tc>
+        <w:tc>
+          <w:tcPr>
+            <w:tcW w:type="dxa" w:w="4320"/>
+            <w:vAlign w:val="center"/>
+          </w:tcPr>
+          <w:p>
+            <w:r/>
+            <w:r>
+              <w:rPr>
+                <w:rFonts w:ascii="Calibri" w:hAnsi="Calibri"/>
+                <w:sz w:val="16"/>
+              </w:rPr>
+              <w:t>models/yolo26/yolo26n_v1_640</w:t>
+            </w:r>
+          </w:p>
+        </w:tc>
+        <w:tc>
+          <w:tcPr>
+            <w:tcW w:type="dxa" w:w="2880"/>
+            <w:vAlign w:val="center"/>
+          </w:tcPr>
+          <w:p>
+            <w:r/>
+            <w:r>
+              <w:rPr>
+                <w:rFonts w:ascii="Calibri" w:hAnsi="Calibri"/>
+                <w:sz w:val="16"/>
+              </w:rPr>
+              <w:t>Weights, results.csv, curves</w:t>
+            </w:r>
+          </w:p>
+        </w:tc>
+      </w:tr>
+      <w:tr>
+        <w:tc>
+          <w:tcPr>
+            <w:tcW w:type="dxa" w:w="2304"/>
+            <w:vAlign w:val="center"/>
+          </w:tcPr>
+          <w:p>
+            <w:r/>
+            <w:r>
+              <w:rPr>
+                <w:rFonts w:ascii="Calibri" w:hAnsi="Calibri"/>
+                <w:sz w:val="16"/>
+              </w:rPr>
+              <w:t>GPT-2 v4 / v5</w:t>
+            </w:r>
+          </w:p>
+        </w:tc>
+        <w:tc>
+          <w:tcPr>
+            <w:tcW w:type="dxa" w:w="4320"/>
+            <w:vAlign w:val="center"/>
+          </w:tcPr>
+          <w:p>
+            <w:r/>
+            <w:r>
+              <w:rPr>
+                <w:rFonts w:ascii="Calibri" w:hAnsi="Calibri"/>
+                <w:sz w:val="16"/>
+              </w:rPr>
+              <w:t>models/gpt2_lora_v4, models/gpt2_lora_v5</w:t>
+            </w:r>
+          </w:p>
+        </w:tc>
+        <w:tc>
+          <w:tcPr>
+            <w:tcW w:type="dxa" w:w="2880"/>
+            <w:vAlign w:val="center"/>
+          </w:tcPr>
+          <w:p>
+            <w:r/>
+            <w:r>
+              <w:rPr>
+                <w:rFonts w:ascii="Calibri" w:hAnsi="Calibri"/>
+                <w:sz w:val="16"/>
+              </w:rPr>
+              <w:t>LoRA adapters</w:t>
+            </w:r>
+          </w:p>
+        </w:tc>
+      </w:tr>
+      <w:tr>
+        <w:tc>
+          <w:tcPr>
+            <w:tcW w:type="dxa" w:w="2304"/>
+            <w:vAlign w:val="center"/>
+          </w:tcPr>
+          <w:p>
+            <w:r/>
+            <w:r>
+              <w:rPr>
+                <w:rFonts w:ascii="Calibri" w:hAnsi="Calibri"/>
+                <w:sz w:val="16"/>
+              </w:rPr>
+              <w:t>ClearML tasks</w:t>
+            </w:r>
+          </w:p>
+        </w:tc>
+        <w:tc>
+          <w:tcPr>
+            <w:tcW w:type="dxa" w:w="4320"/>
+            <w:vAlign w:val="center"/>
+          </w:tcPr>
+          <w:p>
+            <w:r/>
+            <w:r>
+              <w:rPr>
+                <w:rFonts w:ascii="Calibri" w:hAnsi="Calibri"/>
+                <w:sz w:val="16"/>
+              </w:rPr>
+              <w:t>Football Commentator project</w:t>
+            </w:r>
+          </w:p>
+        </w:tc>
+        <w:tc>
+          <w:tcPr>
+            <w:tcW w:type="dxa" w:w="2880"/>
+            <w:vAlign w:val="center"/>
+          </w:tcPr>
+          <w:p>
+            <w:r/>
+            <w:r>
+              <w:rPr>
+                <w:rFonts w:ascii="Calibri" w:hAnsi="Calibri"/>
+                <w:sz w:val="16"/>
+              </w:rPr>
+              <w:t>Scalars, plots, models</w:t>
+            </w:r>
+          </w:p>
+        </w:tc>
+      </w:tr>
+    </w:tbl>
+    <w:p>
+      <w:pPr>
+        <w:spacing w:after="0"/>
+      </w:pPr>
+    </w:p>
+    <w:p>
+      <w:pPr>
         <w:pStyle w:val="Heading2"/>
       </w:pPr>
       <w:r>
@@ -6026,7 +6703,7 @@
         <w:jc w:val="both"/>
       </w:pPr>
       <w:r>
-        <w:t>The upload accepts a JSON match plan with home, away, venue, score, minute, players and positions. The browser parses the JSON and fills the match facts; the backend parser for players and positions is the next implementation step. A minimal schema is shown below.</w:t>
+        <w:t>The upload accepts a JSON match plan. The browser parses the file and fills the match facts; the backend parser for players and positions is the next implementation step. The schema is deliberately small so a club analyst can produce it from a team sheet.</w:t>
       </w:r>
     </w:p>
     <w:p>
@@ -6079,6 +6756,396 @@
     </w:p>
     <w:p>
       <w:pPr>
+        <w:pStyle w:val="ReportCaption"/>
+        <w:jc w:val="left"/>
+      </w:pPr>
+      <w:r>
+        <w:t>Table 10. Match-plan fields.</w:t>
+      </w:r>
+    </w:p>
+    <w:tbl>
+      <w:tblPr>
+        <w:tblW w:type="auto" w:w="0"/>
+        <w:jc w:val="center"/>
+        <w:tblLook w:firstColumn="1" w:firstRow="1" w:lastColumn="0" w:lastRow="0" w:noHBand="0" w:noVBand="1" w:val="04A0"/>
+        <w:tblBorders>
+          <w:top w:val="single" w:sz="4" w:space="0" w:color="BFBFBF"/>
+          <w:left w:val="single" w:sz="4" w:space="0" w:color="BFBFBF"/>
+          <w:bottom w:val="single" w:sz="4" w:space="0" w:color="BFBFBF"/>
+          <w:right w:val="single" w:sz="4" w:space="0" w:color="BFBFBF"/>
+          <w:insideH w:val="single" w:sz="4" w:space="0" w:color="BFBFBF"/>
+          <w:insideV w:val="single" w:sz="4" w:space="0" w:color="BFBFBF"/>
+        </w:tblBorders>
+      </w:tblPr>
+      <w:tblGrid>
+        <w:gridCol w:w="3009"/>
+        <w:gridCol w:w="3009"/>
+        <w:gridCol w:w="3009"/>
+      </w:tblGrid>
+      <w:tr>
+        <w:tc>
+          <w:tcPr>
+            <w:tcW w:type="dxa" w:w="2592"/>
+            <w:shd w:val="clear" w:color="auto" w:fill="E7E6E6"/>
+            <w:vAlign w:val="center"/>
+          </w:tcPr>
+          <w:p>
+            <w:r/>
+            <w:r>
+              <w:rPr>
+                <w:rFonts w:ascii="Calibri" w:hAnsi="Calibri"/>
+                <w:b/>
+                <w:sz w:val="17"/>
+              </w:rPr>
+              <w:t>Field</w:t>
+            </w:r>
+          </w:p>
+        </w:tc>
+        <w:tc>
+          <w:tcPr>
+            <w:tcW w:type="dxa" w:w="1296"/>
+            <w:shd w:val="clear" w:color="auto" w:fill="E7E6E6"/>
+            <w:vAlign w:val="center"/>
+          </w:tcPr>
+          <w:p>
+            <w:r/>
+            <w:r>
+              <w:rPr>
+                <w:rFonts w:ascii="Calibri" w:hAnsi="Calibri"/>
+                <w:b/>
+                <w:sz w:val="17"/>
+              </w:rPr>
+              <w:t>Type</w:t>
+            </w:r>
+          </w:p>
+        </w:tc>
+        <w:tc>
+          <w:tcPr>
+            <w:tcW w:type="dxa" w:w="5472"/>
+            <w:shd w:val="clear" w:color="auto" w:fill="E7E6E6"/>
+            <w:vAlign w:val="center"/>
+          </w:tcPr>
+          <w:p>
+            <w:r/>
+            <w:r>
+              <w:rPr>
+                <w:rFonts w:ascii="Calibri" w:hAnsi="Calibri"/>
+                <w:b/>
+                <w:sz w:val="17"/>
+              </w:rPr>
+              <w:t>Use</w:t>
+            </w:r>
+          </w:p>
+        </w:tc>
+      </w:tr>
+      <w:tr>
+        <w:tc>
+          <w:tcPr>
+            <w:tcW w:type="dxa" w:w="2592"/>
+            <w:vAlign w:val="center"/>
+          </w:tcPr>
+          <w:p>
+            <w:r/>
+            <w:r>
+              <w:rPr>
+                <w:rFonts w:ascii="Calibri" w:hAnsi="Calibri"/>
+                <w:sz w:val="17"/>
+              </w:rPr>
+              <w:t>home / away</w:t>
+            </w:r>
+          </w:p>
+        </w:tc>
+        <w:tc>
+          <w:tcPr>
+            <w:tcW w:type="dxa" w:w="1296"/>
+            <w:vAlign w:val="center"/>
+          </w:tcPr>
+          <w:p>
+            <w:r/>
+            <w:r>
+              <w:rPr>
+                <w:rFonts w:ascii="Calibri" w:hAnsi="Calibri"/>
+                <w:sz w:val="17"/>
+              </w:rPr>
+              <w:t>string</w:t>
+            </w:r>
+          </w:p>
+        </w:tc>
+        <w:tc>
+          <w:tcPr>
+            <w:tcW w:type="dxa" w:w="5472"/>
+            <w:vAlign w:val="center"/>
+          </w:tcPr>
+          <w:p>
+            <w:r/>
+            <w:r>
+              <w:rPr>
+                <w:rFonts w:ascii="Calibri" w:hAnsi="Calibri"/>
+                <w:sz w:val="17"/>
+              </w:rPr>
+              <w:t>Team names and commentary attribution</w:t>
+            </w:r>
+          </w:p>
+        </w:tc>
+      </w:tr>
+      <w:tr>
+        <w:tc>
+          <w:tcPr>
+            <w:tcW w:type="dxa" w:w="2592"/>
+            <w:vAlign w:val="center"/>
+          </w:tcPr>
+          <w:p>
+            <w:r/>
+            <w:r>
+              <w:rPr>
+                <w:rFonts w:ascii="Calibri" w:hAnsi="Calibri"/>
+                <w:sz w:val="17"/>
+              </w:rPr>
+              <w:t>venue</w:t>
+            </w:r>
+          </w:p>
+        </w:tc>
+        <w:tc>
+          <w:tcPr>
+            <w:tcW w:type="dxa" w:w="1296"/>
+            <w:vAlign w:val="center"/>
+          </w:tcPr>
+          <w:p>
+            <w:r/>
+            <w:r>
+              <w:rPr>
+                <w:rFonts w:ascii="Calibri" w:hAnsi="Calibri"/>
+                <w:sz w:val="17"/>
+              </w:rPr>
+              <w:t>string</w:t>
+            </w:r>
+          </w:p>
+        </w:tc>
+        <w:tc>
+          <w:tcPr>
+            <w:tcW w:type="dxa" w:w="5472"/>
+            <w:vAlign w:val="center"/>
+          </w:tcPr>
+          <w:p>
+            <w:r/>
+            <w:r>
+              <w:rPr>
+                <w:rFonts w:ascii="Calibri" w:hAnsi="Calibri"/>
+                <w:sz w:val="17"/>
+              </w:rPr>
+              <w:t>Grounded venue fact</w:t>
+            </w:r>
+          </w:p>
+        </w:tc>
+      </w:tr>
+      <w:tr>
+        <w:tc>
+          <w:tcPr>
+            <w:tcW w:type="dxa" w:w="2592"/>
+            <w:vAlign w:val="center"/>
+          </w:tcPr>
+          <w:p>
+            <w:r/>
+            <w:r>
+              <w:rPr>
+                <w:rFonts w:ascii="Calibri" w:hAnsi="Calibri"/>
+                <w:sz w:val="17"/>
+              </w:rPr>
+              <w:t>score_home / score_away</w:t>
+            </w:r>
+          </w:p>
+        </w:tc>
+        <w:tc>
+          <w:tcPr>
+            <w:tcW w:type="dxa" w:w="1296"/>
+            <w:vAlign w:val="center"/>
+          </w:tcPr>
+          <w:p>
+            <w:r/>
+            <w:r>
+              <w:rPr>
+                <w:rFonts w:ascii="Calibri" w:hAnsi="Calibri"/>
+                <w:sz w:val="17"/>
+              </w:rPr>
+              <w:t>integer</w:t>
+            </w:r>
+          </w:p>
+        </w:tc>
+        <w:tc>
+          <w:tcPr>
+            <w:tcW w:type="dxa" w:w="5472"/>
+            <w:vAlign w:val="center"/>
+          </w:tcPr>
+          <w:p>
+            <w:r/>
+            <w:r>
+              <w:rPr>
+                <w:rFonts w:ascii="Calibri" w:hAnsi="Calibri"/>
+                <w:sz w:val="17"/>
+              </w:rPr>
+              <w:t>Starting score for the fact sheet</w:t>
+            </w:r>
+          </w:p>
+        </w:tc>
+      </w:tr>
+      <w:tr>
+        <w:tc>
+          <w:tcPr>
+            <w:tcW w:type="dxa" w:w="2592"/>
+            <w:vAlign w:val="center"/>
+          </w:tcPr>
+          <w:p>
+            <w:r/>
+            <w:r>
+              <w:rPr>
+                <w:rFonts w:ascii="Calibri" w:hAnsi="Calibri"/>
+                <w:sz w:val="17"/>
+              </w:rPr>
+              <w:t>minute</w:t>
+            </w:r>
+          </w:p>
+        </w:tc>
+        <w:tc>
+          <w:tcPr>
+            <w:tcW w:type="dxa" w:w="1296"/>
+            <w:vAlign w:val="center"/>
+          </w:tcPr>
+          <w:p>
+            <w:r/>
+            <w:r>
+              <w:rPr>
+                <w:rFonts w:ascii="Calibri" w:hAnsi="Calibri"/>
+                <w:sz w:val="17"/>
+              </w:rPr>
+              <w:t>integer</w:t>
+            </w:r>
+          </w:p>
+        </w:tc>
+        <w:tc>
+          <w:tcPr>
+            <w:tcW w:type="dxa" w:w="5472"/>
+            <w:vAlign w:val="center"/>
+          </w:tcPr>
+          <w:p>
+            <w:r/>
+            <w:r>
+              <w:rPr>
+                <w:rFonts w:ascii="Calibri" w:hAnsi="Calibri"/>
+                <w:sz w:val="17"/>
+              </w:rPr>
+              <w:t>Broadcast minute at the start</w:t>
+            </w:r>
+          </w:p>
+        </w:tc>
+      </w:tr>
+      <w:tr>
+        <w:tc>
+          <w:tcPr>
+            <w:tcW w:type="dxa" w:w="2592"/>
+            <w:vAlign w:val="center"/>
+          </w:tcPr>
+          <w:p>
+            <w:r/>
+            <w:r>
+              <w:rPr>
+                <w:rFonts w:ascii="Calibri" w:hAnsi="Calibri"/>
+                <w:sz w:val="17"/>
+              </w:rPr>
+              <w:t>players</w:t>
+            </w:r>
+          </w:p>
+        </w:tc>
+        <w:tc>
+          <w:tcPr>
+            <w:tcW w:type="dxa" w:w="1296"/>
+            <w:vAlign w:val="center"/>
+          </w:tcPr>
+          <w:p>
+            <w:r/>
+            <w:r>
+              <w:rPr>
+                <w:rFonts w:ascii="Calibri" w:hAnsi="Calibri"/>
+                <w:sz w:val="17"/>
+              </w:rPr>
+              <w:t>array</w:t>
+            </w:r>
+          </w:p>
+        </w:tc>
+        <w:tc>
+          <w:tcPr>
+            <w:tcW w:type="dxa" w:w="5472"/>
+            <w:vAlign w:val="center"/>
+          </w:tcPr>
+          <w:p>
+            <w:r/>
+            <w:r>
+              <w:rPr>
+                <w:rFonts w:ascii="Calibri" w:hAnsi="Calibri"/>
+                <w:sz w:val="17"/>
+              </w:rPr>
+              <w:t>Name, team, shirt number, role</w:t>
+            </w:r>
+          </w:p>
+        </w:tc>
+      </w:tr>
+      <w:tr>
+        <w:tc>
+          <w:tcPr>
+            <w:tcW w:type="dxa" w:w="2592"/>
+            <w:vAlign w:val="center"/>
+          </w:tcPr>
+          <w:p>
+            <w:r/>
+            <w:r>
+              <w:rPr>
+                <w:rFonts w:ascii="Calibri" w:hAnsi="Calibri"/>
+                <w:sz w:val="17"/>
+              </w:rPr>
+              <w:t>positions</w:t>
+            </w:r>
+          </w:p>
+        </w:tc>
+        <w:tc>
+          <w:tcPr>
+            <w:tcW w:type="dxa" w:w="1296"/>
+            <w:vAlign w:val="center"/>
+          </w:tcPr>
+          <w:p>
+            <w:r/>
+            <w:r>
+              <w:rPr>
+                <w:rFonts w:ascii="Calibri" w:hAnsi="Calibri"/>
+                <w:sz w:val="17"/>
+              </w:rPr>
+              <w:t>object</w:t>
+            </w:r>
+          </w:p>
+        </w:tc>
+        <w:tc>
+          <w:tcPr>
+            <w:tcW w:type="dxa" w:w="5472"/>
+            <w:vAlign w:val="center"/>
+          </w:tcPr>
+          <w:p>
+            <w:r/>
+            <w:r>
+              <w:rPr>
+                <w:rFonts w:ascii="Calibri" w:hAnsi="Calibri"/>
+                <w:sz w:val="17"/>
+              </w:rPr>
+              <w:t>Formation/role or pitch coordinates</w:t>
+            </w:r>
+          </w:p>
+        </w:tc>
+      </w:tr>
+    </w:tbl>
+    <w:p>
+      <w:pPr>
+        <w:spacing w:after="0"/>
+      </w:pPr>
+    </w:p>
+    <w:p>
+      <w:pPr>
         <w:pStyle w:val="Heading2"/>
       </w:pPr>
       <w:r>
@@ -6090,8 +7157,1395 @@
         <w:jc w:val="both"/>
       </w:pPr>
       <w:r>
-        <w:t>Cloud: $1.21/h for an ml.g5.2xlarge. Local electricity: $0.30/kWh. Human team: two people at $50/h for three live hours or four pre-recorded hours, illustrative rather than a quote. API-Football: free tier for the requests made; paid plans excluded. Fish Audio: free tier; paid TTS, storage and egress excluded. The local electricity figure excludes GPU hardware.</w:t>
-      </w:r>
+        <w:t>Cloud: $1.21/h for an ml.g5.2xlarge. Local electricity: $0.30/kWh at 100 W. Human team: two people at $50/h for three live hours or four pre-recorded hours; this is illustrative, not a quote. API-Football: free tier for the requests made; paid plans excluded. Fish Audio: free tier; paid TTS, storage and egress excluded. The local electricity figure excludes GPU hardware.</w:t>
+      </w:r>
+    </w:p>
+    <w:p>
+      <w:pPr>
+        <w:pStyle w:val="ReportCaption"/>
+        <w:jc w:val="left"/>
+      </w:pPr>
+      <w:r>
+        <w:t>Table 11. Cost calculations used in Section 8.7.</w:t>
+      </w:r>
+    </w:p>
+    <w:tbl>
+      <w:tblPr>
+        <w:tblW w:type="auto" w:w="0"/>
+        <w:jc w:val="center"/>
+        <w:tblLook w:firstColumn="1" w:firstRow="1" w:lastColumn="0" w:lastRow="0" w:noHBand="0" w:noVBand="1" w:val="04A0"/>
+        <w:tblBorders>
+          <w:top w:val="single" w:sz="4" w:space="0" w:color="BFBFBF"/>
+          <w:left w:val="single" w:sz="4" w:space="0" w:color="BFBFBF"/>
+          <w:bottom w:val="single" w:sz="4" w:space="0" w:color="BFBFBF"/>
+          <w:right w:val="single" w:sz="4" w:space="0" w:color="BFBFBF"/>
+          <w:insideH w:val="single" w:sz="4" w:space="0" w:color="BFBFBF"/>
+          <w:insideV w:val="single" w:sz="4" w:space="0" w:color="BFBFBF"/>
+        </w:tblBorders>
+      </w:tblPr>
+      <w:tblGrid>
+        <w:gridCol w:w="3009"/>
+        <w:gridCol w:w="3009"/>
+        <w:gridCol w:w="3009"/>
+      </w:tblGrid>
+      <w:tr>
+        <w:tc>
+          <w:tcPr>
+            <w:tcW w:type="dxa" w:w="2304"/>
+            <w:shd w:val="clear" w:color="auto" w:fill="E7E6E6"/>
+            <w:vAlign w:val="center"/>
+          </w:tcPr>
+          <w:p>
+            <w:r/>
+            <w:r>
+              <w:rPr>
+                <w:rFonts w:ascii="Calibri" w:hAnsi="Calibri"/>
+                <w:b/>
+                <w:sz w:val="17"/>
+              </w:rPr>
+              <w:t>Item</w:t>
+            </w:r>
+          </w:p>
+        </w:tc>
+        <w:tc>
+          <w:tcPr>
+            <w:tcW w:type="dxa" w:w="4896"/>
+            <w:shd w:val="clear" w:color="auto" w:fill="E7E6E6"/>
+            <w:vAlign w:val="center"/>
+          </w:tcPr>
+          <w:p>
+            <w:r/>
+            <w:r>
+              <w:rPr>
+                <w:rFonts w:ascii="Calibri" w:hAnsi="Calibri"/>
+                <w:b/>
+                <w:sz w:val="17"/>
+              </w:rPr>
+              <w:t>Calculation</w:t>
+            </w:r>
+          </w:p>
+        </w:tc>
+        <w:tc>
+          <w:tcPr>
+            <w:tcW w:type="dxa" w:w="1584"/>
+            <w:shd w:val="clear" w:color="auto" w:fill="E7E6E6"/>
+            <w:vAlign w:val="center"/>
+          </w:tcPr>
+          <w:p>
+            <w:r/>
+            <w:r>
+              <w:rPr>
+                <w:rFonts w:ascii="Calibri" w:hAnsi="Calibri"/>
+                <w:b/>
+                <w:sz w:val="17"/>
+              </w:rPr>
+              <w:t>Result</w:t>
+            </w:r>
+          </w:p>
+        </w:tc>
+      </w:tr>
+      <w:tr>
+        <w:tc>
+          <w:tcPr>
+            <w:tcW w:type="dxa" w:w="2304"/>
+            <w:vAlign w:val="center"/>
+          </w:tcPr>
+          <w:p>
+            <w:r/>
+            <w:r>
+              <w:rPr>
+                <w:rFonts w:ascii="Calibri" w:hAnsi="Calibri"/>
+                <w:sz w:val="17"/>
+              </w:rPr>
+              <w:t>Cloud inference</w:t>
+            </w:r>
+          </w:p>
+        </w:tc>
+        <w:tc>
+          <w:tcPr>
+            <w:tcW w:type="dxa" w:w="4896"/>
+            <w:vAlign w:val="center"/>
+          </w:tcPr>
+          <w:p>
+            <w:r/>
+            <w:r>
+              <w:rPr>
+                <w:rFonts w:ascii="Calibri" w:hAnsi="Calibri"/>
+                <w:sz w:val="17"/>
+              </w:rPr>
+              <w:t>$1.21/h × 19.4/60 h</w:t>
+            </w:r>
+          </w:p>
+        </w:tc>
+        <w:tc>
+          <w:tcPr>
+            <w:tcW w:type="dxa" w:w="1584"/>
+            <w:vAlign w:val="center"/>
+          </w:tcPr>
+          <w:p>
+            <w:r/>
+            <w:r>
+              <w:rPr>
+                <w:rFonts w:ascii="Calibri" w:hAnsi="Calibri"/>
+                <w:sz w:val="17"/>
+              </w:rPr>
+              <w:t>$0.392</w:t>
+            </w:r>
+          </w:p>
+        </w:tc>
+      </w:tr>
+      <w:tr>
+        <w:tc>
+          <w:tcPr>
+            <w:tcW w:type="dxa" w:w="2304"/>
+            <w:vAlign w:val="center"/>
+          </w:tcPr>
+          <w:p>
+            <w:r/>
+            <w:r>
+              <w:rPr>
+                <w:rFonts w:ascii="Calibri" w:hAnsi="Calibri"/>
+                <w:sz w:val="17"/>
+              </w:rPr>
+              <w:t>Local electricity</w:t>
+            </w:r>
+          </w:p>
+        </w:tc>
+        <w:tc>
+          <w:tcPr>
+            <w:tcW w:type="dxa" w:w="4896"/>
+            <w:vAlign w:val="center"/>
+          </w:tcPr>
+          <w:p>
+            <w:r/>
+            <w:r>
+              <w:rPr>
+                <w:rFonts w:ascii="Calibri" w:hAnsi="Calibri"/>
+                <w:sz w:val="17"/>
+              </w:rPr>
+              <w:t>0.1 kW × 19.4/60 h × $0.30/kWh</w:t>
+            </w:r>
+          </w:p>
+        </w:tc>
+        <w:tc>
+          <w:tcPr>
+            <w:tcW w:type="dxa" w:w="1584"/>
+            <w:vAlign w:val="center"/>
+          </w:tcPr>
+          <w:p>
+            <w:r/>
+            <w:r>
+              <w:rPr>
+                <w:rFonts w:ascii="Calibri" w:hAnsi="Calibri"/>
+                <w:sz w:val="17"/>
+              </w:rPr>
+              <w:t>$0.010</w:t>
+            </w:r>
+          </w:p>
+        </w:tc>
+      </w:tr>
+      <w:tr>
+        <w:tc>
+          <w:tcPr>
+            <w:tcW w:type="dxa" w:w="2304"/>
+            <w:vAlign w:val="center"/>
+          </w:tcPr>
+          <w:p>
+            <w:r/>
+            <w:r>
+              <w:rPr>
+                <w:rFonts w:ascii="Calibri" w:hAnsi="Calibri"/>
+                <w:sz w:val="17"/>
+              </w:rPr>
+              <w:t>Cloud training</w:t>
+            </w:r>
+          </w:p>
+        </w:tc>
+        <w:tc>
+          <w:tcPr>
+            <w:tcW w:type="dxa" w:w="4896"/>
+            <w:vAlign w:val="center"/>
+          </w:tcPr>
+          <w:p>
+            <w:r/>
+            <w:r>
+              <w:rPr>
+                <w:rFonts w:ascii="Calibri" w:hAnsi="Calibri"/>
+                <w:sz w:val="17"/>
+              </w:rPr>
+              <w:t>$1.21/h × 3.64 h</w:t>
+            </w:r>
+          </w:p>
+        </w:tc>
+        <w:tc>
+          <w:tcPr>
+            <w:tcW w:type="dxa" w:w="1584"/>
+            <w:vAlign w:val="center"/>
+          </w:tcPr>
+          <w:p>
+            <w:r/>
+            <w:r>
+              <w:rPr>
+                <w:rFonts w:ascii="Calibri" w:hAnsi="Calibri"/>
+                <w:sz w:val="17"/>
+              </w:rPr>
+              <w:t>$4.40</w:t>
+            </w:r>
+          </w:p>
+        </w:tc>
+      </w:tr>
+      <w:tr>
+        <w:tc>
+          <w:tcPr>
+            <w:tcW w:type="dxa" w:w="2304"/>
+            <w:vAlign w:val="center"/>
+          </w:tcPr>
+          <w:p>
+            <w:r/>
+            <w:r>
+              <w:rPr>
+                <w:rFonts w:ascii="Calibri" w:hAnsi="Calibri"/>
+                <w:sz w:val="17"/>
+              </w:rPr>
+              <w:t>Local training</w:t>
+            </w:r>
+          </w:p>
+        </w:tc>
+        <w:tc>
+          <w:tcPr>
+            <w:tcW w:type="dxa" w:w="4896"/>
+            <w:vAlign w:val="center"/>
+          </w:tcPr>
+          <w:p>
+            <w:r/>
+            <w:r>
+              <w:rPr>
+                <w:rFonts w:ascii="Calibri" w:hAnsi="Calibri"/>
+                <w:sz w:val="17"/>
+              </w:rPr>
+              <w:t>0.1 kW × 3.64 h × $0.30/kWh</w:t>
+            </w:r>
+          </w:p>
+        </w:tc>
+        <w:tc>
+          <w:tcPr>
+            <w:tcW w:type="dxa" w:w="1584"/>
+            <w:vAlign w:val="center"/>
+          </w:tcPr>
+          <w:p>
+            <w:r/>
+            <w:r>
+              <w:rPr>
+                <w:rFonts w:ascii="Calibri" w:hAnsi="Calibri"/>
+                <w:sz w:val="17"/>
+              </w:rPr>
+              <w:t>$0.109</w:t>
+            </w:r>
+          </w:p>
+        </w:tc>
+      </w:tr>
+      <w:tr>
+        <w:tc>
+          <w:tcPr>
+            <w:tcW w:type="dxa" w:w="2304"/>
+            <w:vAlign w:val="center"/>
+          </w:tcPr>
+          <w:p>
+            <w:r/>
+            <w:r>
+              <w:rPr>
+                <w:rFonts w:ascii="Calibri" w:hAnsi="Calibri"/>
+                <w:sz w:val="17"/>
+              </w:rPr>
+              <w:t>Human live team</w:t>
+            </w:r>
+          </w:p>
+        </w:tc>
+        <w:tc>
+          <w:tcPr>
+            <w:tcW w:type="dxa" w:w="4896"/>
+            <w:vAlign w:val="center"/>
+          </w:tcPr>
+          <w:p>
+            <w:r/>
+            <w:r>
+              <w:rPr>
+                <w:rFonts w:ascii="Calibri" w:hAnsi="Calibri"/>
+                <w:sz w:val="17"/>
+              </w:rPr>
+              <w:t>2 people × $50/h × 3 h</w:t>
+            </w:r>
+          </w:p>
+        </w:tc>
+        <w:tc>
+          <w:tcPr>
+            <w:tcW w:type="dxa" w:w="1584"/>
+            <w:vAlign w:val="center"/>
+          </w:tcPr>
+          <w:p>
+            <w:r/>
+            <w:r>
+              <w:rPr>
+                <w:rFonts w:ascii="Calibri" w:hAnsi="Calibri"/>
+                <w:sz w:val="17"/>
+              </w:rPr>
+              <w:t>$300</w:t>
+            </w:r>
+          </w:p>
+        </w:tc>
+      </w:tr>
+      <w:tr>
+        <w:tc>
+          <w:tcPr>
+            <w:tcW w:type="dxa" w:w="2304"/>
+            <w:vAlign w:val="center"/>
+          </w:tcPr>
+          <w:p>
+            <w:r/>
+            <w:r>
+              <w:rPr>
+                <w:rFonts w:ascii="Calibri" w:hAnsi="Calibri"/>
+                <w:sz w:val="17"/>
+              </w:rPr>
+              <w:t>Human pre-recorded</w:t>
+            </w:r>
+          </w:p>
+        </w:tc>
+        <w:tc>
+          <w:tcPr>
+            <w:tcW w:type="dxa" w:w="4896"/>
+            <w:vAlign w:val="center"/>
+          </w:tcPr>
+          <w:p>
+            <w:r/>
+            <w:r>
+              <w:rPr>
+                <w:rFonts w:ascii="Calibri" w:hAnsi="Calibri"/>
+                <w:sz w:val="17"/>
+              </w:rPr>
+              <w:t>2 people × $50/h × 4 h</w:t>
+            </w:r>
+          </w:p>
+        </w:tc>
+        <w:tc>
+          <w:tcPr>
+            <w:tcW w:type="dxa" w:w="1584"/>
+            <w:vAlign w:val="center"/>
+          </w:tcPr>
+          <w:p>
+            <w:r/>
+            <w:r>
+              <w:rPr>
+                <w:rFonts w:ascii="Calibri" w:hAnsi="Calibri"/>
+                <w:sz w:val="17"/>
+              </w:rPr>
+              <w:t>$400</w:t>
+            </w:r>
+          </w:p>
+        </w:tc>
+      </w:tr>
+    </w:tbl>
+    <w:p>
+      <w:pPr>
+        <w:spacing w:after="0"/>
+      </w:pPr>
+    </w:p>
+    <w:p>
+      <w:pPr>
+        <w:pStyle w:val="Heading2"/>
+      </w:pPr>
+      <w:r>
+        <w:t>Appendix D — Demo Screenshots</w:t>
+      </w:r>
+    </w:p>
+    <w:p>
+      <w:pPr>
+        <w:jc w:val="both"/>
+      </w:pPr>
+      <w:r>
+        <w:t>The upload and training screens complete the demo walkthrough. The upload accepts a video and a match plan; the training screen reads the YOLO26n run and the GPT-2 adapters from ClearML-backed artifacts. These are live application screenshots, not mock-ups.</w:t>
+      </w:r>
+    </w:p>
+    <w:p>
+      <w:pPr>
+        <w:spacing w:before="80" w:after="40"/>
+        <w:jc w:val="center"/>
+      </w:pPr>
+      <w:r>
+        <w:drawing>
+          <wp:inline xmlns:a="http://schemas.openxmlformats.org/drawingml/2006/main" xmlns:pic="http://schemas.openxmlformats.org/drawingml/2006/picture">
+            <wp:extent cx="5669280" cy="2751963"/>
+            <wp:docPr id="14" name="Picture 14"/>
+            <wp:cNvGraphicFramePr>
+              <a:graphicFrameLocks noChangeAspect="1"/>
+            </wp:cNvGraphicFramePr>
+            <a:graphic>
+              <a:graphicData uri="http://schemas.openxmlformats.org/drawingml/2006/picture">
+                <pic:pic>
+                  <pic:nvPicPr>
+                    <pic:cNvPr id="0" name="demo_upload.png"/>
+                    <pic:cNvPicPr/>
+                  </pic:nvPicPr>
+                  <pic:blipFill>
+                    <a:blip r:embed="rId23"/>
+                    <a:stretch>
+                      <a:fillRect/>
+                    </a:stretch>
+                  </pic:blipFill>
+                  <pic:spPr>
+                    <a:xfrm>
+                      <a:off x="0" y="0"/>
+                      <a:ext cx="5669280" cy="2751963"/>
+                    </a:xfrm>
+                    <a:prstGeom prst="rect"/>
+                  </pic:spPr>
+                </pic:pic>
+              </a:graphicData>
+            </a:graphic>
+          </wp:inline>
+        </w:drawing>
+      </w:r>
+    </w:p>
+    <w:p>
+      <w:pPr>
+        <w:pStyle w:val="ReportCaption"/>
+        <w:jc w:val="left"/>
+      </w:pPr>
+      <w:r>
+        <w:t>Figure 14. Live upload screen. The video drop and match-plan drop are separate; JSON plans are parsed for teams, venue, score, minute and player/position counts.</w:t>
+      </w:r>
+    </w:p>
+    <w:p>
+      <w:pPr>
+        <w:spacing w:before="80" w:after="40"/>
+        <w:jc w:val="center"/>
+      </w:pPr>
+      <w:r>
+        <w:drawing>
+          <wp:inline xmlns:a="http://schemas.openxmlformats.org/drawingml/2006/main" xmlns:pic="http://schemas.openxmlformats.org/drawingml/2006/picture">
+            <wp:extent cx="5669280" cy="6606286"/>
+            <wp:docPr id="15" name="Picture 15"/>
+            <wp:cNvGraphicFramePr>
+              <a:graphicFrameLocks noChangeAspect="1"/>
+            </wp:cNvGraphicFramePr>
+            <a:graphic>
+              <a:graphicData uri="http://schemas.openxmlformats.org/drawingml/2006/picture">
+                <pic:pic>
+                  <pic:nvPicPr>
+                    <pic:cNvPr id="0" name="demo_training.png"/>
+                    <pic:cNvPicPr/>
+                  </pic:nvPicPr>
+                  <pic:blipFill>
+                    <a:blip r:embed="rId24"/>
+                    <a:stretch>
+                      <a:fillRect/>
+                    </a:stretch>
+                  </pic:blipFill>
+                  <pic:spPr>
+                    <a:xfrm>
+                      <a:off x="0" y="0"/>
+                      <a:ext cx="5669280" cy="6606286"/>
+                    </a:xfrm>
+                    <a:prstGeom prst="rect"/>
+                  </pic:spPr>
+                </pic:pic>
+              </a:graphicData>
+            </a:graphic>
+          </wp:inline>
+        </w:drawing>
+      </w:r>
+    </w:p>
+    <w:p>
+      <w:pPr>
+        <w:pStyle w:val="ReportCaption"/>
+        <w:jc w:val="left"/>
+      </w:pPr>
+      <w:r>
+        <w:t>Figure 15. Live training screen. YOLO26n metrics and curves, GPT-2 v4/v5 loss, ClearML links and the model artifacts are shown in the same board.</w:t>
+      </w:r>
+    </w:p>
+    <w:p>
+      <w:pPr>
+        <w:pStyle w:val="Heading2"/>
+      </w:pPr>
+      <w:r>
+        <w:t>Appendix E — Repository Map</w:t>
+      </w:r>
+    </w:p>
+    <w:p>
+      <w:pPr>
+        <w:pStyle w:val="ReportCaption"/>
+        <w:jc w:val="left"/>
+      </w:pPr>
+      <w:r>
+        <w:t>Table 12. Main repository areas.</w:t>
+      </w:r>
+    </w:p>
+    <w:tbl>
+      <w:tblPr>
+        <w:tblW w:type="auto" w:w="0"/>
+        <w:jc w:val="center"/>
+        <w:tblLook w:firstColumn="1" w:firstRow="1" w:lastColumn="0" w:lastRow="0" w:noHBand="0" w:noVBand="1" w:val="04A0"/>
+        <w:tblBorders>
+          <w:top w:val="single" w:sz="4" w:space="0" w:color="BFBFBF"/>
+          <w:left w:val="single" w:sz="4" w:space="0" w:color="BFBFBF"/>
+          <w:bottom w:val="single" w:sz="4" w:space="0" w:color="BFBFBF"/>
+          <w:right w:val="single" w:sz="4" w:space="0" w:color="BFBFBF"/>
+          <w:insideH w:val="single" w:sz="4" w:space="0" w:color="BFBFBF"/>
+          <w:insideV w:val="single" w:sz="4" w:space="0" w:color="BFBFBF"/>
+        </w:tblBorders>
+      </w:tblPr>
+      <w:tblGrid>
+        <w:gridCol w:w="4513"/>
+        <w:gridCol w:w="4513"/>
+      </w:tblGrid>
+      <w:tr>
+        <w:tc>
+          <w:tcPr>
+            <w:tcW w:type="dxa" w:w="3168"/>
+            <w:shd w:val="clear" w:color="auto" w:fill="E7E6E6"/>
+            <w:vAlign w:val="center"/>
+          </w:tcPr>
+          <w:p>
+            <w:r/>
+            <w:r>
+              <w:rPr>
+                <w:rFonts w:ascii="Calibri" w:hAnsi="Calibri"/>
+                <w:b/>
+                <w:sz w:val="17"/>
+              </w:rPr>
+              <w:t>Path</w:t>
+            </w:r>
+          </w:p>
+        </w:tc>
+        <w:tc>
+          <w:tcPr>
+            <w:tcW w:type="dxa" w:w="6192"/>
+            <w:shd w:val="clear" w:color="auto" w:fill="E7E6E6"/>
+            <w:vAlign w:val="center"/>
+          </w:tcPr>
+          <w:p>
+            <w:r/>
+            <w:r>
+              <w:rPr>
+                <w:rFonts w:ascii="Calibri" w:hAnsi="Calibri"/>
+                <w:b/>
+                <w:sz w:val="17"/>
+              </w:rPr>
+              <w:t>Contents</w:t>
+            </w:r>
+          </w:p>
+        </w:tc>
+      </w:tr>
+      <w:tr>
+        <w:tc>
+          <w:tcPr>
+            <w:tcW w:type="dxa" w:w="3168"/>
+            <w:vAlign w:val="center"/>
+          </w:tcPr>
+          <w:p>
+            <w:r/>
+            <w:r>
+              <w:rPr>
+                <w:rFonts w:ascii="Calibri" w:hAnsi="Calibri"/>
+                <w:sz w:val="17"/>
+              </w:rPr>
+              <w:t>app/pipeline.py</w:t>
+            </w:r>
+          </w:p>
+        </w:tc>
+        <w:tc>
+          <w:tcPr>
+            <w:tcW w:type="dxa" w:w="6192"/>
+            <w:vAlign w:val="center"/>
+          </w:tcPr>
+          <w:p>
+            <w:r/>
+            <w:r>
+              <w:rPr>
+                <w:rFonts w:ascii="Calibri" w:hAnsi="Calibri"/>
+                <w:sz w:val="17"/>
+              </w:rPr>
+              <w:t>End-to-end orchestration</w:t>
+            </w:r>
+          </w:p>
+        </w:tc>
+      </w:tr>
+      <w:tr>
+        <w:tc>
+          <w:tcPr>
+            <w:tcW w:type="dxa" w:w="3168"/>
+            <w:vAlign w:val="center"/>
+          </w:tcPr>
+          <w:p>
+            <w:r/>
+            <w:r>
+              <w:rPr>
+                <w:rFonts w:ascii="Calibri" w:hAnsi="Calibri"/>
+                <w:sz w:val="17"/>
+              </w:rPr>
+              <w:t>app/vision/</w:t>
+            </w:r>
+          </w:p>
+        </w:tc>
+        <w:tc>
+          <w:tcPr>
+            <w:tcW w:type="dxa" w:w="6192"/>
+            <w:vAlign w:val="center"/>
+          </w:tcPr>
+          <w:p>
+            <w:r/>
+            <w:r>
+              <w:rPr>
+                <w:rFonts w:ascii="Calibri" w:hAnsi="Calibri"/>
+                <w:sz w:val="17"/>
+              </w:rPr>
+              <w:t>Score bug, sampling, labels, detector, tracking</w:t>
+            </w:r>
+          </w:p>
+        </w:tc>
+      </w:tr>
+      <w:tr>
+        <w:tc>
+          <w:tcPr>
+            <w:tcW w:type="dxa" w:w="3168"/>
+            <w:vAlign w:val="center"/>
+          </w:tcPr>
+          <w:p>
+            <w:r/>
+            <w:r>
+              <w:rPr>
+                <w:rFonts w:ascii="Calibri" w:hAnsi="Calibri"/>
+                <w:sz w:val="17"/>
+              </w:rPr>
+              <w:t>app/commentary_gpt2.py</w:t>
+            </w:r>
+          </w:p>
+        </w:tc>
+        <w:tc>
+          <w:tcPr>
+            <w:tcW w:type="dxa" w:w="6192"/>
+            <w:vAlign w:val="center"/>
+          </w:tcPr>
+          <w:p>
+            <w:r/>
+            <w:r>
+              <w:rPr>
+                <w:rFonts w:ascii="Calibri" w:hAnsi="Calibri"/>
+                <w:sz w:val="17"/>
+              </w:rPr>
+              <w:t>GPT-2 prompt, generation, validator</w:t>
+            </w:r>
+          </w:p>
+        </w:tc>
+      </w:tr>
+      <w:tr>
+        <w:tc>
+          <w:tcPr>
+            <w:tcW w:type="dxa" w:w="3168"/>
+            <w:vAlign w:val="center"/>
+          </w:tcPr>
+          <w:p>
+            <w:r/>
+            <w:r>
+              <w:rPr>
+                <w:rFonts w:ascii="Calibri" w:hAnsi="Calibri"/>
+                <w:sz w:val="17"/>
+              </w:rPr>
+              <w:t>app/tts.py</w:t>
+            </w:r>
+          </w:p>
+        </w:tc>
+        <w:tc>
+          <w:tcPr>
+            <w:tcW w:type="dxa" w:w="6192"/>
+            <w:vAlign w:val="center"/>
+          </w:tcPr>
+          <w:p>
+            <w:r/>
+            <w:r>
+              <w:rPr>
+                <w:rFonts w:ascii="Calibri" w:hAnsi="Calibri"/>
+                <w:sz w:val="17"/>
+              </w:rPr>
+              <w:t>Fish Audio primary, edge-tts fallback</w:t>
+            </w:r>
+          </w:p>
+        </w:tc>
+      </w:tr>
+      <w:tr>
+        <w:tc>
+          <w:tcPr>
+            <w:tcW w:type="dxa" w:w="3168"/>
+            <w:vAlign w:val="center"/>
+          </w:tcPr>
+          <w:p>
+            <w:r/>
+            <w:r>
+              <w:rPr>
+                <w:rFonts w:ascii="Calibri" w:hAnsi="Calibri"/>
+                <w:sz w:val="17"/>
+              </w:rPr>
+              <w:t>app/webapp.py</w:t>
+            </w:r>
+          </w:p>
+        </w:tc>
+        <w:tc>
+          <w:tcPr>
+            <w:tcW w:type="dxa" w:w="6192"/>
+            <w:vAlign w:val="center"/>
+          </w:tcPr>
+          <w:p>
+            <w:r/>
+            <w:r>
+              <w:rPr>
+                <w:rFonts w:ascii="Calibri" w:hAnsi="Calibri"/>
+                <w:sz w:val="17"/>
+              </w:rPr>
+              <w:t>Upload job queue and web API</w:t>
+            </w:r>
+          </w:p>
+        </w:tc>
+      </w:tr>
+      <w:tr>
+        <w:tc>
+          <w:tcPr>
+            <w:tcW w:type="dxa" w:w="3168"/>
+            <w:vAlign w:val="center"/>
+          </w:tcPr>
+          <w:p>
+            <w:r/>
+            <w:r>
+              <w:rPr>
+                <w:rFonts w:ascii="Calibri" w:hAnsi="Calibri"/>
+                <w:sz w:val="17"/>
+              </w:rPr>
+              <w:t>scripts/</w:t>
+            </w:r>
+          </w:p>
+        </w:tc>
+        <w:tc>
+          <w:tcPr>
+            <w:tcW w:type="dxa" w:w="6192"/>
+            <w:vAlign w:val="center"/>
+          </w:tcPr>
+          <w:p>
+            <w:r/>
+            <w:r>
+              <w:rPr>
+                <w:rFonts w:ascii="Calibri" w:hAnsi="Calibri"/>
+                <w:sz w:val="17"/>
+              </w:rPr>
+              <w:t>Training, evaluation, report builders</w:t>
+            </w:r>
+          </w:p>
+        </w:tc>
+      </w:tr>
+      <w:tr>
+        <w:tc>
+          <w:tcPr>
+            <w:tcW w:type="dxa" w:w="3168"/>
+            <w:vAlign w:val="center"/>
+          </w:tcPr>
+          <w:p>
+            <w:r/>
+            <w:r>
+              <w:rPr>
+                <w:rFonts w:ascii="Calibri" w:hAnsi="Calibri"/>
+                <w:sz w:val="17"/>
+              </w:rPr>
+              <w:t>docs/</w:t>
+            </w:r>
+          </w:p>
+        </w:tc>
+        <w:tc>
+          <w:tcPr>
+            <w:tcW w:type="dxa" w:w="6192"/>
+            <w:vAlign w:val="center"/>
+          </w:tcPr>
+          <w:p>
+            <w:r/>
+            <w:r>
+              <w:rPr>
+                <w:rFonts w:ascii="Calibri" w:hAnsi="Calibri"/>
+                <w:sz w:val="17"/>
+              </w:rPr>
+              <w:t>Report, figures, runbook, walkthrough</w:t>
+            </w:r>
+          </w:p>
+        </w:tc>
+      </w:tr>
+      <w:tr>
+        <w:tc>
+          <w:tcPr>
+            <w:tcW w:type="dxa" w:w="3168"/>
+            <w:vAlign w:val="center"/>
+          </w:tcPr>
+          <w:p>
+            <w:r/>
+            <w:r>
+              <w:rPr>
+                <w:rFonts w:ascii="Calibri" w:hAnsi="Calibri"/>
+                <w:sz w:val="17"/>
+              </w:rPr>
+              <w:t>output/</w:t>
+            </w:r>
+          </w:p>
+        </w:tc>
+        <w:tc>
+          <w:tcPr>
+            <w:tcW w:type="dxa" w:w="6192"/>
+            <w:vAlign w:val="center"/>
+          </w:tcPr>
+          <w:p>
+            <w:r/>
+            <w:r>
+              <w:rPr>
+                <w:rFonts w:ascii="Calibri" w:hAnsi="Calibri"/>
+                <w:sz w:val="17"/>
+              </w:rPr>
+              <w:t>Generated clips, transcripts, metrics (gitignored)</w:t>
+            </w:r>
+          </w:p>
+        </w:tc>
+      </w:tr>
+      <w:tr>
+        <w:tc>
+          <w:tcPr>
+            <w:tcW w:type="dxa" w:w="3168"/>
+            <w:vAlign w:val="center"/>
+          </w:tcPr>
+          <w:p>
+            <w:r/>
+            <w:r>
+              <w:rPr>
+                <w:rFonts w:ascii="Calibri" w:hAnsi="Calibri"/>
+                <w:sz w:val="17"/>
+              </w:rPr>
+              <w:t>models/</w:t>
+            </w:r>
+          </w:p>
+        </w:tc>
+        <w:tc>
+          <w:tcPr>
+            <w:tcW w:type="dxa" w:w="6192"/>
+            <w:vAlign w:val="center"/>
+          </w:tcPr>
+          <w:p>
+            <w:r/>
+            <w:r>
+              <w:rPr>
+                <w:rFonts w:ascii="Calibri" w:hAnsi="Calibri"/>
+                <w:sz w:val="17"/>
+              </w:rPr>
+              <w:t>Checkpoints and adapters (gitignored)</w:t>
+            </w:r>
+          </w:p>
+        </w:tc>
+      </w:tr>
+    </w:tbl>
+    <w:p>
+      <w:pPr>
+        <w:spacing w:after="0"/>
+      </w:pPr>
+    </w:p>
+    <w:p>
+      <w:pPr>
+        <w:pStyle w:val="Heading2"/>
+      </w:pPr>
+      <w:r>
+        <w:t>Appendix F — Evaluation Checklist</w:t>
+      </w:r>
+    </w:p>
+    <w:p>
+      <w:pPr>
+        <w:pStyle w:val="ReportCaption"/>
+        <w:jc w:val="left"/>
+      </w:pPr>
+      <w:r>
+        <w:t>Table 13. What is complete and what still needs external data or people.</w:t>
+      </w:r>
+    </w:p>
+    <w:tbl>
+      <w:tblPr>
+        <w:tblW w:type="auto" w:w="0"/>
+        <w:jc w:val="center"/>
+        <w:tblLook w:firstColumn="1" w:firstRow="1" w:lastColumn="0" w:lastRow="0" w:noHBand="0" w:noVBand="1" w:val="04A0"/>
+        <w:tblBorders>
+          <w:top w:val="single" w:sz="4" w:space="0" w:color="BFBFBF"/>
+          <w:left w:val="single" w:sz="4" w:space="0" w:color="BFBFBF"/>
+          <w:bottom w:val="single" w:sz="4" w:space="0" w:color="BFBFBF"/>
+          <w:right w:val="single" w:sz="4" w:space="0" w:color="BFBFBF"/>
+          <w:insideH w:val="single" w:sz="4" w:space="0" w:color="BFBFBF"/>
+          <w:insideV w:val="single" w:sz="4" w:space="0" w:color="BFBFBF"/>
+        </w:tblBorders>
+      </w:tblPr>
+      <w:tblGrid>
+        <w:gridCol w:w="3009"/>
+        <w:gridCol w:w="3009"/>
+        <w:gridCol w:w="3009"/>
+      </w:tblGrid>
+      <w:tr>
+        <w:tc>
+          <w:tcPr>
+            <w:tcW w:type="dxa" w:w="2880"/>
+            <w:shd w:val="clear" w:color="auto" w:fill="E7E6E6"/>
+            <w:vAlign w:val="center"/>
+          </w:tcPr>
+          <w:p>
+            <w:r/>
+            <w:r>
+              <w:rPr>
+                <w:rFonts w:ascii="Calibri" w:hAnsi="Calibri"/>
+                <w:b/>
+                <w:sz w:val="17"/>
+              </w:rPr>
+              <w:t>Item</w:t>
+            </w:r>
+          </w:p>
+        </w:tc>
+        <w:tc>
+          <w:tcPr>
+            <w:tcW w:type="dxa" w:w="1296"/>
+            <w:shd w:val="clear" w:color="auto" w:fill="E7E6E6"/>
+            <w:vAlign w:val="center"/>
+          </w:tcPr>
+          <w:p>
+            <w:r/>
+            <w:r>
+              <w:rPr>
+                <w:rFonts w:ascii="Calibri" w:hAnsi="Calibri"/>
+                <w:b/>
+                <w:sz w:val="17"/>
+              </w:rPr>
+              <w:t>Status</w:t>
+            </w:r>
+          </w:p>
+        </w:tc>
+        <w:tc>
+          <w:tcPr>
+            <w:tcW w:type="dxa" w:w="5184"/>
+            <w:shd w:val="clear" w:color="auto" w:fill="E7E6E6"/>
+            <w:vAlign w:val="center"/>
+          </w:tcPr>
+          <w:p>
+            <w:r/>
+            <w:r>
+              <w:rPr>
+                <w:rFonts w:ascii="Calibri" w:hAnsi="Calibri"/>
+                <w:b/>
+                <w:sz w:val="17"/>
+              </w:rPr>
+              <w:t>Note</w:t>
+            </w:r>
+          </w:p>
+        </w:tc>
+      </w:tr>
+      <w:tr>
+        <w:tc>
+          <w:tcPr>
+            <w:tcW w:type="dxa" w:w="2880"/>
+            <w:vAlign w:val="center"/>
+          </w:tcPr>
+          <w:p>
+            <w:r/>
+            <w:r>
+              <w:rPr>
+                <w:rFonts w:ascii="Calibri" w:hAnsi="Calibri"/>
+                <w:sz w:val="17"/>
+              </w:rPr>
+              <w:t>Commentary metrics, 40 prompts</w:t>
+            </w:r>
+          </w:p>
+        </w:tc>
+        <w:tc>
+          <w:tcPr>
+            <w:tcW w:type="dxa" w:w="1296"/>
+            <w:vAlign w:val="center"/>
+          </w:tcPr>
+          <w:p>
+            <w:r/>
+            <w:r>
+              <w:rPr>
+                <w:rFonts w:ascii="Calibri" w:hAnsi="Calibri"/>
+                <w:sz w:val="17"/>
+              </w:rPr>
+              <w:t>Complete</w:t>
+            </w:r>
+          </w:p>
+        </w:tc>
+        <w:tc>
+          <w:tcPr>
+            <w:tcW w:type="dxa" w:w="5184"/>
+            <w:vAlign w:val="center"/>
+          </w:tcPr>
+          <w:p>
+            <w:r/>
+            <w:r>
+              <w:rPr>
+                <w:rFonts w:ascii="Calibri" w:hAnsi="Calibri"/>
+                <w:sz w:val="17"/>
+              </w:rPr>
+              <w:t>BLEU/ROUGE/METEOR + bootstrap CIs</w:t>
+            </w:r>
+          </w:p>
+        </w:tc>
+      </w:tr>
+      <w:tr>
+        <w:tc>
+          <w:tcPr>
+            <w:tcW w:type="dxa" w:w="2880"/>
+            <w:vAlign w:val="center"/>
+          </w:tcPr>
+          <w:p>
+            <w:r/>
+            <w:r>
+              <w:rPr>
+                <w:rFonts w:ascii="Calibri" w:hAnsi="Calibri"/>
+                <w:sz w:val="17"/>
+              </w:rPr>
+              <w:t>Event spotting, 10 moments</w:t>
+            </w:r>
+          </w:p>
+        </w:tc>
+        <w:tc>
+          <w:tcPr>
+            <w:tcW w:type="dxa" w:w="1296"/>
+            <w:vAlign w:val="center"/>
+          </w:tcPr>
+          <w:p>
+            <w:r/>
+            <w:r>
+              <w:rPr>
+                <w:rFonts w:ascii="Calibri" w:hAnsi="Calibri"/>
+                <w:sz w:val="17"/>
+              </w:rPr>
+              <w:t>Complete</w:t>
+            </w:r>
+          </w:p>
+        </w:tc>
+        <w:tc>
+          <w:tcPr>
+            <w:tcW w:type="dxa" w:w="5184"/>
+            <w:vAlign w:val="center"/>
+          </w:tcPr>
+          <w:p>
+            <w:r/>
+            <w:r>
+              <w:rPr>
+                <w:rFonts w:ascii="Calibri" w:hAnsi="Calibri"/>
+                <w:sz w:val="17"/>
+              </w:rPr>
+              <w:t>Recall 0.40; goals 2/2</w:t>
+            </w:r>
+          </w:p>
+        </w:tc>
+      </w:tr>
+      <w:tr>
+        <w:tc>
+          <w:tcPr>
+            <w:tcW w:type="dxa" w:w="2880"/>
+            <w:vAlign w:val="center"/>
+          </w:tcPr>
+          <w:p>
+            <w:r/>
+            <w:r>
+              <w:rPr>
+                <w:rFonts w:ascii="Calibri" w:hAnsi="Calibri"/>
+                <w:sz w:val="17"/>
+              </w:rPr>
+              <w:t>Reproducibility / ClearML</w:t>
+            </w:r>
+          </w:p>
+        </w:tc>
+        <w:tc>
+          <w:tcPr>
+            <w:tcW w:type="dxa" w:w="1296"/>
+            <w:vAlign w:val="center"/>
+          </w:tcPr>
+          <w:p>
+            <w:r/>
+            <w:r>
+              <w:rPr>
+                <w:rFonts w:ascii="Calibri" w:hAnsi="Calibri"/>
+                <w:sz w:val="17"/>
+              </w:rPr>
+              <w:t>Complete</w:t>
+            </w:r>
+          </w:p>
+        </w:tc>
+        <w:tc>
+          <w:tcPr>
+            <w:tcW w:type="dxa" w:w="5184"/>
+            <w:vAlign w:val="center"/>
+          </w:tcPr>
+          <w:p>
+            <w:r/>
+            <w:r>
+              <w:rPr>
+                <w:rFonts w:ascii="Calibri" w:hAnsi="Calibri"/>
+                <w:sz w:val="17"/>
+              </w:rPr>
+              <w:t>Scripts, artifacts, task IDs</w:t>
+            </w:r>
+          </w:p>
+        </w:tc>
+      </w:tr>
+      <w:tr>
+        <w:tc>
+          <w:tcPr>
+            <w:tcW w:type="dxa" w:w="2880"/>
+            <w:vAlign w:val="center"/>
+          </w:tcPr>
+          <w:p>
+            <w:r/>
+            <w:r>
+              <w:rPr>
+                <w:rFonts w:ascii="Calibri" w:hAnsi="Calibri"/>
+                <w:sz w:val="17"/>
+              </w:rPr>
+              <w:t>Independent event annotation</w:t>
+            </w:r>
+          </w:p>
+        </w:tc>
+        <w:tc>
+          <w:tcPr>
+            <w:tcW w:type="dxa" w:w="1296"/>
+            <w:vAlign w:val="center"/>
+          </w:tcPr>
+          <w:p>
+            <w:r/>
+            <w:r>
+              <w:rPr>
+                <w:rFonts w:ascii="Calibri" w:hAnsi="Calibri"/>
+                <w:sz w:val="17"/>
+              </w:rPr>
+              <w:t>Pending</w:t>
+            </w:r>
+          </w:p>
+        </w:tc>
+        <w:tc>
+          <w:tcPr>
+            <w:tcW w:type="dxa" w:w="5184"/>
+            <w:vAlign w:val="center"/>
+          </w:tcPr>
+          <w:p>
+            <w:r/>
+            <w:r>
+              <w:rPr>
+                <w:rFonts w:ascii="Calibri" w:hAnsi="Calibri"/>
+                <w:sz w:val="17"/>
+              </w:rPr>
+              <w:t>Needs human labels on 2–3 matches</w:t>
+            </w:r>
+          </w:p>
+        </w:tc>
+      </w:tr>
+      <w:tr>
+        <w:tc>
+          <w:tcPr>
+            <w:tcW w:type="dxa" w:w="2880"/>
+            <w:vAlign w:val="center"/>
+          </w:tcPr>
+          <w:p>
+            <w:r/>
+            <w:r>
+              <w:rPr>
+                <w:rFonts w:ascii="Calibri" w:hAnsi="Calibri"/>
+                <w:sz w:val="17"/>
+              </w:rPr>
+              <w:t>Human commentary evaluation</w:t>
+            </w:r>
+          </w:p>
+        </w:tc>
+        <w:tc>
+          <w:tcPr>
+            <w:tcW w:type="dxa" w:w="1296"/>
+            <w:vAlign w:val="center"/>
+          </w:tcPr>
+          <w:p>
+            <w:r/>
+            <w:r>
+              <w:rPr>
+                <w:rFonts w:ascii="Calibri" w:hAnsi="Calibri"/>
+                <w:sz w:val="17"/>
+              </w:rPr>
+              <w:t>Pending</w:t>
+            </w:r>
+          </w:p>
+        </w:tc>
+        <w:tc>
+          <w:tcPr>
+            <w:tcW w:type="dxa" w:w="5184"/>
+            <w:vAlign w:val="center"/>
+          </w:tcPr>
+          <w:p>
+            <w:r/>
+            <w:r>
+              <w:rPr>
+                <w:rFonts w:ascii="Calibri" w:hAnsi="Calibri"/>
+                <w:sz w:val="17"/>
+              </w:rPr>
+              <w:t>Protocol in Section 8.9</w:t>
+            </w:r>
+          </w:p>
+        </w:tc>
+      </w:tr>
+      <w:tr>
+        <w:tc>
+          <w:tcPr>
+            <w:tcW w:type="dxa" w:w="2880"/>
+            <w:vAlign w:val="center"/>
+          </w:tcPr>
+          <w:p>
+            <w:r/>
+            <w:r>
+              <w:rPr>
+                <w:rFonts w:ascii="Calibri" w:hAnsi="Calibri"/>
+                <w:sz w:val="17"/>
+              </w:rPr>
+              <w:t>Tracking MOTA/IDF1</w:t>
+            </w:r>
+          </w:p>
+        </w:tc>
+        <w:tc>
+          <w:tcPr>
+            <w:tcW w:type="dxa" w:w="1296"/>
+            <w:vAlign w:val="center"/>
+          </w:tcPr>
+          <w:p>
+            <w:r/>
+            <w:r>
+              <w:rPr>
+                <w:rFonts w:ascii="Calibri" w:hAnsi="Calibri"/>
+                <w:sz w:val="17"/>
+              </w:rPr>
+              <w:t>Pending</w:t>
+            </w:r>
+          </w:p>
+        </w:tc>
+        <w:tc>
+          <w:tcPr>
+            <w:tcW w:type="dxa" w:w="5184"/>
+            <w:vAlign w:val="center"/>
+          </w:tcPr>
+          <w:p>
+            <w:r/>
+            <w:r>
+              <w:rPr>
+                <w:rFonts w:ascii="Calibri" w:hAnsi="Calibri"/>
+                <w:sz w:val="17"/>
+              </w:rPr>
+              <w:t>Needs frame-level ground truth</w:t>
+            </w:r>
+          </w:p>
+        </w:tc>
+      </w:tr>
+      <w:tr>
+        <w:tc>
+          <w:tcPr>
+            <w:tcW w:type="dxa" w:w="2880"/>
+            <w:vAlign w:val="center"/>
+          </w:tcPr>
+          <w:p>
+            <w:r/>
+            <w:r>
+              <w:rPr>
+                <w:rFonts w:ascii="Calibri" w:hAnsi="Calibri"/>
+                <w:sz w:val="17"/>
+              </w:rPr>
+              <w:t>Equal-budget YOLO comparison</w:t>
+            </w:r>
+          </w:p>
+        </w:tc>
+        <w:tc>
+          <w:tcPr>
+            <w:tcW w:type="dxa" w:w="1296"/>
+            <w:vAlign w:val="center"/>
+          </w:tcPr>
+          <w:p>
+            <w:r/>
+            <w:r>
+              <w:rPr>
+                <w:rFonts w:ascii="Calibri" w:hAnsi="Calibri"/>
+                <w:sz w:val="17"/>
+              </w:rPr>
+              <w:t>Pending</w:t>
+            </w:r>
+          </w:p>
+        </w:tc>
+        <w:tc>
+          <w:tcPr>
+            <w:tcW w:type="dxa" w:w="5184"/>
+            <w:vAlign w:val="center"/>
+          </w:tcPr>
+          <w:p>
+            <w:r/>
+            <w:r>
+              <w:rPr>
+                <w:rFonts w:ascii="Calibri" w:hAnsi="Calibri"/>
+                <w:sz w:val="17"/>
+              </w:rPr>
+              <w:t>Needs matched epochs/GPU time</w:t>
+            </w:r>
+          </w:p>
+        </w:tc>
+      </w:tr>
+      <w:tr>
+        <w:tc>
+          <w:tcPr>
+            <w:tcW w:type="dxa" w:w="2880"/>
+            <w:vAlign w:val="center"/>
+          </w:tcPr>
+          <w:p>
+            <w:r/>
+            <w:r>
+              <w:rPr>
+                <w:rFonts w:ascii="Calibri" w:hAnsi="Calibri"/>
+                <w:sz w:val="17"/>
+              </w:rPr>
+              <w:t>Same-match API vs video</w:t>
+            </w:r>
+          </w:p>
+        </w:tc>
+        <w:tc>
+          <w:tcPr>
+            <w:tcW w:type="dxa" w:w="1296"/>
+            <w:vAlign w:val="center"/>
+          </w:tcPr>
+          <w:p>
+            <w:r/>
+            <w:r>
+              <w:rPr>
+                <w:rFonts w:ascii="Calibri" w:hAnsi="Calibri"/>
+                <w:sz w:val="17"/>
+              </w:rPr>
+              <w:t>Pending</w:t>
+            </w:r>
+          </w:p>
+        </w:tc>
+        <w:tc>
+          <w:tcPr>
+            <w:tcW w:type="dxa" w:w="5184"/>
+            <w:vAlign w:val="center"/>
+          </w:tcPr>
+          <w:p>
+            <w:r/>
+            <w:r>
+              <w:rPr>
+                <w:rFonts w:ascii="Calibri" w:hAnsi="Calibri"/>
+                <w:sz w:val="17"/>
+              </w:rPr>
+              <w:t>Needs API access and the match video</w:t>
+            </w:r>
+          </w:p>
+        </w:tc>
+      </w:tr>
+    </w:tbl>
+    <w:p>
+      <w:pPr>
+        <w:spacing w:after="0"/>
+      </w:pPr>
     </w:p>
     <w:sectPr>
       <w:footerReference w:type="default" r:id="rId7"/>

</xml_diff>

<commit_message>
Add corrected student details and nine weekly capstone logs
Update the report title page to Aryaman Sharma, 25158763, Prof. Nabin Sharma; add nine separate weekly progress logs with activities, status, issues and next steps.

Co-Authored-By: Claude Code <noreply@anthropic.com>
</commit_message>
<xml_diff>
--- a/docs/Matchcall_Project_Report.docx
+++ b/docs/Matchcall_Project_Report.docx
@@ -97,7 +97,7 @@
         <w:t xml:space="preserve">Student Name: </w:t>
       </w:r>
       <w:r>
-        <w:t>Aryaman</w:t>
+        <w:t>Aryaman Sharma</w:t>
       </w:r>
       <w:r>
         <w:br/>
@@ -109,7 +109,7 @@
         <w:t xml:space="preserve">Student ID: </w:t>
       </w:r>
       <w:r>
-        <w:t>________________________</w:t>
+        <w:t>25158763</w:t>
       </w:r>
       <w:r>
         <w:br/>
@@ -121,7 +121,7 @@
         <w:t xml:space="preserve">Supervisor Name: </w:t>
       </w:r>
       <w:r>
-        <w:t>Nabin Sir</w:t>
+        <w:t>Prof. Nabin Sharma</w:t>
       </w:r>
     </w:p>
     <w:p>

</xml_diff>